<commit_message>
feat: implement dashboard navigation, report filtering, and SPPD prompt system
</commit_message>
<xml_diff>
--- a/templates/sppdpenerimaan_template.docx
+++ b/templates/sppdpenerimaan_template.docx
@@ -77,6 +77,19 @@
         </w:rPr>
         <w:t xml:space="preserve"> </w:t>
       </w:r>
+      <w:r>
+        <w:rPr>
+          <w:rFonts w:ascii="Bookman Old Style" w:eastAsia="Times New Roman" w:hAnsi="Bookman Old Style" w:cs="Times New Roman"/>
+          <w:b/>
+          <w:bCs/>
+          <w:kern w:val="0"/>
+          <w:sz w:val="28"/>
+          <w:szCs w:val="28"/>
+          <w:lang w:val="en-US"/>
+          <w14:ligatures w14:val="none"/>
+        </w:rPr>
+        <w:t>2026</w:t>
+      </w:r>
     </w:p>
     <w:p>
       <w:pPr>
@@ -141,33 +154,7 @@
           <w:lang w:val="en-US"/>
           <w14:ligatures w14:val="none"/>
         </w:rPr>
-        <w:t>{nama_desa}</w:t>
-      </w:r>
-      <w:r>
-        <w:rPr>
-          <w:rFonts w:ascii="Bookman Old Style" w:eastAsia="Times New Roman" w:hAnsi="Bookman Old Style" w:cs="Times New Roman"/>
-          <w:b/>
-          <w:bCs/>
-          <w:kern w:val="0"/>
-          <w:sz w:val="28"/>
-          <w:szCs w:val="28"/>
-          <w:lang w:val="en-US"/>
-          <w14:ligatures w14:val="none"/>
-        </w:rPr>
-        <w:t xml:space="preserve"> </w:t>
-      </w:r>
-      <w:r>
-        <w:rPr>
-          <w:rFonts w:ascii="Bookman Old Style" w:eastAsia="Times New Roman" w:hAnsi="Bookman Old Style" w:cs="Times New Roman"/>
-          <w:b/>
-          <w:bCs/>
-          <w:kern w:val="0"/>
-          <w:sz w:val="28"/>
-          <w:szCs w:val="28"/>
-          <w:lang w:val="en-US"/>
-          <w14:ligatures w14:val="none"/>
-        </w:rPr>
-        <w:t>{nama_kecamatan}{nama_kabupaten}</w:t>
+        <w:t>KEMBANGLIMUS BOROBUDUR MAGELANG</w:t>
       </w:r>
     </w:p>
     <w:p>
@@ -782,7 +769,31 @@
                 <w:lang w:val="en-US"/>
                 <w14:ligatures w14:val="none"/>
               </w:rPr>
-              <w:t>{#nama_pegawai}{no}</w:t>
+              <w:t>{#nama_</w:t>
+            </w:r>
+            <w:proofErr w:type="gramStart"/>
+            <w:r>
+              <w:rPr>
+                <w:rFonts w:ascii="Bookman Old Style" w:eastAsia="Times New Roman" w:hAnsi="Bookman Old Style" w:cs="Times New Roman"/>
+                <w:kern w:val="0"/>
+                <w:sz w:val="24"/>
+                <w:szCs w:val="24"/>
+                <w:lang w:val="en-US"/>
+                <w14:ligatures w14:val="none"/>
+              </w:rPr>
+              <w:t>pegawai}{</w:t>
+            </w:r>
+            <w:proofErr w:type="gramEnd"/>
+            <w:r>
+              <w:rPr>
+                <w:rFonts w:ascii="Bookman Old Style" w:eastAsia="Times New Roman" w:hAnsi="Bookman Old Style" w:cs="Times New Roman"/>
+                <w:kern w:val="0"/>
+                <w:sz w:val="24"/>
+                <w:szCs w:val="24"/>
+                <w:lang w:val="en-US"/>
+                <w14:ligatures w14:val="none"/>
+              </w:rPr>
+              <w:t>no}</w:t>
             </w:r>
           </w:p>
         </w:tc>

</xml_diff>